<commit_message>
Keep per-shot prompts under Higgsfield's 3000-char limit
Compress the style block into a compact style tag and shorten character
tokens so every self-contained per-shot prompt stays well under 3000
characters (demo pack now 558-783 chars each) while retaining all style and
character info. Add the 3000-char rule + compact style tag to the production
guide; regenerate the EP07 demo pack.

https://claude.ai/code/session_012yrhJkQFRZkiQjmevywnos
</commit_message>
<xml_diff>
--- a/EP07_risk-pooling_vampire-bat/EP07_shot-list.docx
+++ b/EP07_risk-pooling_vampire-bat/EP07_shot-list.docx
@@ -656,7 +656,7 @@
                 <w:b w:val="0"/>
                 <w:sz w:val="17"/>
               </w:rPr>
-              <w:t>Close-up of the teal-blue fox host (rounded chunky body</w:t>
+              <w:t>Close-up of teal-blue fox host (rounded chunky body</w:t>
             </w:r>
           </w:p>
         </w:tc>
@@ -748,7 +748,7 @@
                 <w:b w:val="0"/>
                 <w:sz w:val="17"/>
               </w:rPr>
-              <w:t>Same the teal-blue fox host (rounded chunky body</w:t>
+              <w:t>Same teal-blue fox host (rounded chunky body</w:t>
             </w:r>
           </w:p>
         </w:tc>
@@ -840,7 +840,7 @@
                 <w:b w:val="0"/>
                 <w:sz w:val="17"/>
               </w:rPr>
-              <w:t>Wide shot of one small lone a simple rounded teal humanoid figure with no detail…</w:t>
+              <w:t>Wide shot of one small lone simple rounded teal humanoid figure (no facial detai…</w:t>
             </w:r>
           </w:p>
         </w:tc>
@@ -932,7 +932,7 @@
                 <w:b w:val="0"/>
                 <w:sz w:val="17"/>
               </w:rPr>
-              <w:t>Medium shot of a friendly rounded vampire bat (deep-navy body</w:t>
+              <w:t>Medium shot of rounded vampire bat (deep-navy body</w:t>
             </w:r>
           </w:p>
         </w:tc>
@@ -1024,7 +1024,7 @@
                 <w:b w:val="0"/>
                 <w:sz w:val="17"/>
               </w:rPr>
-              <w:t>Medium shot of the teal-blue fox host (rounded chunky body</w:t>
+              <w:t>Medium shot of teal-blue fox host (rounded chunky body</w:t>
             </w:r>
           </w:p>
         </w:tc>
@@ -1116,7 +1116,7 @@
                 <w:b w:val="0"/>
                 <w:sz w:val="17"/>
               </w:rPr>
-              <w:t>the teal-blue fox host (rounded chunky body</w:t>
+              <w:t>teal-blue fox host (rounded chunky body</w:t>
             </w:r>
           </w:p>
         </w:tc>
@@ -1208,7 +1208,7 @@
                 <w:b w:val="0"/>
                 <w:sz w:val="17"/>
               </w:rPr>
-              <w:t>Medium shot of the teal-blue fox host (rounded chunky body</w:t>
+              <w:t>Medium shot of teal-blue fox host (rounded chunky body</w:t>
             </w:r>
           </w:p>
         </w:tc>
@@ -1300,7 +1300,7 @@
                 <w:b w:val="0"/>
                 <w:sz w:val="17"/>
               </w:rPr>
-              <w:t>A single a simple rounded teal humanoid figure with no detailed face on an ochre…</w:t>
+              <w:t>A single simple rounded teal humanoid figure (no facial detail) on an ochre fiel…</w:t>
             </w:r>
           </w:p>
         </w:tc>
@@ -1392,7 +1392,7 @@
                 <w:b w:val="0"/>
                 <w:sz w:val="17"/>
               </w:rPr>
-              <w:t>The same a simple rounded teal humanoid figure with no detailed face as the coin</w:t>
+              <w:t>The same simple rounded teal humanoid figure (no facial detail) as the coin</w:t>
             </w:r>
           </w:p>
         </w:tc>
@@ -1484,7 +1484,7 @@
                 <w:b w:val="0"/>
                 <w:sz w:val="17"/>
               </w:rPr>
-              <w:t>The same a simple rounded teal humanoid figure with no detailed face standing al…</w:t>
+              <w:t>The same simple rounded teal humanoid figure (no facial detail) standing alone b…</w:t>
             </w:r>
           </w:p>
         </w:tc>
@@ -1576,7 +1576,7 @@
                 <w:b w:val="0"/>
                 <w:sz w:val="17"/>
               </w:rPr>
-              <w:t>the teal-blue fox host (rounded chunky body</w:t>
+              <w:t>teal-blue fox host (rounded chunky body</w:t>
             </w:r>
           </w:p>
         </w:tc>
@@ -1668,7 +1668,7 @@
                 <w:b w:val="0"/>
                 <w:sz w:val="17"/>
               </w:rPr>
-              <w:t>Centered hero shot of a friendly rounded vampire bat (deep-navy body</w:t>
+              <w:t>Centered hero shot of rounded vampire bat (deep-navy body</w:t>
             </w:r>
           </w:p>
         </w:tc>
@@ -1760,7 +1760,7 @@
                 <w:b w:val="0"/>
                 <w:sz w:val="17"/>
               </w:rPr>
-              <w:t>a friendly rounded vampire bat (deep-navy body</w:t>
+              <w:t>rounded vampire bat (deep-navy body</w:t>
             </w:r>
           </w:p>
         </w:tc>
@@ -1852,7 +1852,7 @@
                 <w:b w:val="0"/>
                 <w:sz w:val="17"/>
               </w:rPr>
-              <w:t>a friendly rounded vampire bat (deep-navy body</w:t>
+              <w:t>rounded vampire bat (deep-navy body</w:t>
             </w:r>
           </w:p>
         </w:tc>
@@ -1944,7 +1944,7 @@
                 <w:b w:val="0"/>
                 <w:sz w:val="17"/>
               </w:rPr>
-              <w:t>a friendly rounded vampire bat (deep-navy body</w:t>
+              <w:t>rounded vampire bat (deep-navy body</w:t>
             </w:r>
           </w:p>
         </w:tc>
@@ -2036,7 +2036,7 @@
                 <w:b w:val="0"/>
                 <w:sz w:val="17"/>
               </w:rPr>
-              <w:t>a friendly rounded vampire bat (deep-navy body</w:t>
+              <w:t>rounded vampire bat (deep-navy body</w:t>
             </w:r>
           </w:p>
         </w:tc>
@@ -2128,7 +2128,7 @@
                 <w:b w:val="0"/>
                 <w:sz w:val="17"/>
               </w:rPr>
-              <w:t>Wide shot of a friendly rounded vampire bat (deep-navy body</w:t>
+              <w:t>Wide shot of rounded vampire bat (deep-navy body</w:t>
             </w:r>
           </w:p>
         </w:tc>
@@ -2220,7 +2220,7 @@
                 <w:b w:val="0"/>
                 <w:sz w:val="17"/>
               </w:rPr>
-              <w:t>a friendly rounded vampire bat (deep-navy body</w:t>
+              <w:t>rounded vampire bat (deep-navy body</w:t>
             </w:r>
           </w:p>
         </w:tc>
@@ -2312,7 +2312,7 @@
                 <w:b w:val="0"/>
                 <w:sz w:val="17"/>
               </w:rPr>
-              <w:t>Two of a friendly rounded vampire bat (deep-navy body</w:t>
+              <w:t>Two of rounded vampire bat (deep-navy body</w:t>
             </w:r>
           </w:p>
         </w:tc>
@@ -2588,7 +2588,7 @@
                 <w:b w:val="0"/>
                 <w:sz w:val="17"/>
               </w:rPr>
-              <w:t>Close-up of the giving a friendly rounded vampire bat (deep-navy body</w:t>
+              <w:t>Close-up of the giving rounded vampire bat (deep-navy body</w:t>
             </w:r>
           </w:p>
         </w:tc>
@@ -2772,7 +2772,7 @@
                 <w:b w:val="0"/>
                 <w:sz w:val="17"/>
               </w:rPr>
-              <w:t>the teal-blue fox host (rounded chunky body</w:t>
+              <w:t>teal-blue fox host (rounded chunky body</w:t>
             </w:r>
           </w:p>
         </w:tc>
@@ -2864,7 +2864,7 @@
                 <w:b w:val="0"/>
                 <w:sz w:val="17"/>
               </w:rPr>
-              <w:t>A web of several of a friendly rounded vampire bat (deep-navy body</w:t>
+              <w:t>A web of several of rounded vampire bat (deep-navy body</w:t>
             </w:r>
           </w:p>
         </w:tc>
@@ -2956,7 +2956,7 @@
                 <w:b w:val="0"/>
                 <w:sz w:val="17"/>
               </w:rPr>
-              <w:t>The same web of a friendly rounded vampire bat (deep-navy body</w:t>
+              <w:t>The same web of rounded vampire bat (deep-navy body</w:t>
             </w:r>
           </w:p>
         </w:tc>
@@ -3048,7 +3048,7 @@
                 <w:b w:val="0"/>
                 <w:sz w:val="17"/>
               </w:rPr>
-              <w:t>A single a friendly rounded vampire bat (deep-navy body</w:t>
+              <w:t>A single rounded vampire bat (deep-navy body</w:t>
             </w:r>
           </w:p>
         </w:tc>
@@ -3140,7 +3140,7 @@
                 <w:b w:val="0"/>
                 <w:sz w:val="17"/>
               </w:rPr>
-              <w:t>The same a friendly rounded vampire bat (deep-navy body</w:t>
+              <w:t>The same rounded vampire bat (deep-navy body</w:t>
             </w:r>
           </w:p>
         </w:tc>
@@ -3232,7 +3232,7 @@
                 <w:b w:val="0"/>
                 <w:sz w:val="17"/>
               </w:rPr>
-              <w:t>One lone a friendly rounded vampire bat (deep-navy body</w:t>
+              <w:t>One lone rounded vampire bat (deep-navy body</w:t>
             </w:r>
           </w:p>
         </w:tc>
@@ -3324,7 +3324,7 @@
                 <w:b w:val="0"/>
                 <w:sz w:val="17"/>
               </w:rPr>
-              <w:t>Many of a friendly rounded vampire bat (deep-navy body</w:t>
+              <w:t>Many of rounded vampire bat (deep-navy body</w:t>
             </w:r>
           </w:p>
         </w:tc>
@@ -3600,7 +3600,7 @@
                 <w:b w:val="0"/>
                 <w:sz w:val="17"/>
               </w:rPr>
-              <w:t>A a friendly rounded vampire bat (deep-navy body</w:t>
+              <w:t>A rounded vampire bat (deep-navy body</w:t>
             </w:r>
           </w:p>
         </w:tc>
@@ -3692,7 +3692,7 @@
                 <w:b w:val="0"/>
                 <w:sz w:val="17"/>
               </w:rPr>
-              <w:t>A a friendly rounded vampire bat (deep-navy body</w:t>
+              <w:t>A rounded vampire bat (deep-navy body</w:t>
             </w:r>
           </w:p>
         </w:tc>
@@ -3784,7 +3784,7 @@
                 <w:b w:val="0"/>
                 <w:sz w:val="17"/>
               </w:rPr>
-              <w:t>The whole warm hollow stylized as a cozy little 'company' of a friendly rounded …</w:t>
+              <w:t>The whole warm hollow stylized as a cozy little 'company' of rounded vampire bat…</w:t>
             </w:r>
           </w:p>
         </w:tc>
@@ -3876,7 +3876,7 @@
                 <w:b w:val="0"/>
                 <w:sz w:val="17"/>
               </w:rPr>
-              <w:t>the teal-blue fox host (rounded chunky body</w:t>
+              <w:t>teal-blue fox host (rounded chunky body</w:t>
             </w:r>
           </w:p>
         </w:tc>
@@ -3968,7 +3968,7 @@
                 <w:b w:val="0"/>
                 <w:sz w:val="17"/>
               </w:rPr>
-              <w:t>the teal-blue fox host (rounded chunky body</w:t>
+              <w:t>teal-blue fox host (rounded chunky body</w:t>
             </w:r>
           </w:p>
         </w:tc>
@@ -4060,7 +4060,7 @@
                 <w:b w:val="0"/>
                 <w:sz w:val="17"/>
               </w:rPr>
-              <w:t>A a simple rounded teal humanoid figure with no detailed face dropping a small c…</w:t>
+              <w:t>A simple rounded teal humanoid figure (no facial detail) dropping a small coral …</w:t>
             </w:r>
           </w:p>
         </w:tc>
@@ -4152,7 +4152,7 @@
                 <w:b w:val="0"/>
                 <w:sz w:val="17"/>
               </w:rPr>
-              <w:t>The same a simple rounded teal humanoid figure with no detailed face shown with …</w:t>
+              <w:t>The same simple rounded teal humanoid figure (no facial detail) shown with a fai…</w:t>
             </w:r>
           </w:p>
         </w:tc>
@@ -4336,7 +4336,7 @@
                 <w:b w:val="0"/>
                 <w:sz w:val="17"/>
               </w:rPr>
-              <w:t>A coral disaster bolt striking down at a a simple rounded teal humanoid figure w…</w:t>
+              <w:t>A coral disaster bolt striking down at a simple rounded teal humanoid figure (no…</w:t>
             </w:r>
           </w:p>
         </w:tc>
@@ -4428,7 +4428,7 @@
                 <w:b w:val="0"/>
                 <w:sz w:val="17"/>
               </w:rPr>
-              <w:t>the teal-blue fox host (rounded chunky body</w:t>
+              <w:t>teal-blue fox host (rounded chunky body</w:t>
             </w:r>
           </w:p>
         </w:tc>
@@ -4520,7 +4520,7 @@
                 <w:b w:val="0"/>
                 <w:sz w:val="17"/>
               </w:rPr>
-              <w:t>Warm scene of several of a friendly rounded vampire bat (deep-navy body</w:t>
+              <w:t>Warm scene of several of rounded vampire bat (deep-navy body</w:t>
             </w:r>
           </w:p>
         </w:tc>
@@ -4888,7 +4888,7 @@
                 <w:b w:val="0"/>
                 <w:sz w:val="17"/>
               </w:rPr>
-              <w:t>the teal-blue fox host (rounded chunky body</w:t>
+              <w:t>teal-blue fox host (rounded chunky body</w:t>
             </w:r>
           </w:p>
         </w:tc>
@@ -4980,7 +4980,7 @@
                 <w:b w:val="0"/>
                 <w:sz w:val="17"/>
               </w:rPr>
-              <w:t>the teal-blue fox host (rounded chunky body</w:t>
+              <w:t>teal-blue fox host (rounded chunky body</w:t>
             </w:r>
           </w:p>
         </w:tc>
@@ -5072,7 +5072,7 @@
                 <w:b w:val="0"/>
                 <w:sz w:val="17"/>
               </w:rPr>
-              <w:t>Medium shot of the teal-blue fox host (rounded chunky body</w:t>
+              <w:t>Medium shot of teal-blue fox host (rounded chunky body</w:t>
             </w:r>
           </w:p>
         </w:tc>
@@ -5164,7 +5164,7 @@
                 <w:b w:val="0"/>
                 <w:sz w:val="17"/>
               </w:rPr>
-              <w:t>A lone a simple rounded teal humanoid figure with no detailed face straining und…</w:t>
+              <w:t>A lone simple rounded teal humanoid figure (no facial detail) straining under a …</w:t>
             </w:r>
           </w:p>
         </w:tc>
@@ -5256,7 +5256,7 @@
                 <w:b w:val="0"/>
                 <w:sz w:val="17"/>
               </w:rPr>
-              <w:t>The same huge load now lifted easily by many of a simple rounded teal humanoid f…</w:t>
+              <w:t>The same huge load now lifted easily by many of simple rounded teal humanoid fig…</w:t>
             </w:r>
           </w:p>
         </w:tc>
@@ -5348,7 +5348,7 @@
                 <w:b w:val="0"/>
                 <w:sz w:val="17"/>
               </w:rPr>
-              <w:t>A a simple rounded teal humanoid figure with no detailed face calmly placing a s…</w:t>
+              <w:t>A simple rounded teal humanoid figure (no facial detail) calmly placing a small …</w:t>
             </w:r>
           </w:p>
         </w:tc>
@@ -5532,7 +5532,7 @@
                 <w:b w:val="0"/>
                 <w:sz w:val="17"/>
               </w:rPr>
-              <w:t>Intimate shot of a friendly rounded vampire bat (deep-navy body</w:t>
+              <w:t>Intimate shot of rounded vampire bat (deep-navy body</w:t>
             </w:r>
           </w:p>
         </w:tc>
@@ -5624,7 +5624,7 @@
                 <w:b w:val="0"/>
                 <w:sz w:val="17"/>
               </w:rPr>
-              <w:t>the teal-blue fox host (rounded chunky body</w:t>
+              <w:t>teal-blue fox host (rounded chunky body</w:t>
             </w:r>
           </w:p>
         </w:tc>
@@ -5716,7 +5716,7 @@
                 <w:b w:val="0"/>
                 <w:sz w:val="17"/>
               </w:rPr>
-              <w:t>the teal-blue fox host (rounded chunky body</w:t>
+              <w:t>teal-blue fox host (rounded chunky body</w:t>
             </w:r>
           </w:p>
         </w:tc>

</xml_diff>